<commit_message>
took CTA method decision
</commit_message>
<xml_diff>
--- a/Week3/The Through-Line Map Content and CTAs.docx
+++ b/Week3/The Through-Line Map Content and CTAs.docx
@@ -141,31 +141,7 @@
           <w:sz w:val="28"/>
           <w:szCs w:val="28"/>
         </w:rPr>
-        <w:t>“</w:t>
-      </w:r>
-      <w:r>
-        <w:rPr>
-          <w:rFonts w:asciiTheme="minorBidi" w:hAnsiTheme="minorBidi"/>
-          <w:b/>
-          <w:bCs/>
-          <w:i/>
-          <w:iCs/>
-          <w:sz w:val="28"/>
-          <w:szCs w:val="28"/>
-        </w:rPr>
-        <w:t>I solve real problems and ship working solutions.</w:t>
-      </w:r>
-      <w:r>
-        <w:rPr>
-          <w:rFonts w:asciiTheme="minorBidi" w:hAnsiTheme="minorBidi"/>
-          <w:b/>
-          <w:bCs/>
-          <w:i/>
-          <w:iCs/>
-          <w:sz w:val="28"/>
-          <w:szCs w:val="28"/>
-        </w:rPr>
-        <w:t>”</w:t>
+        <w:t>“I solve real problems and ship working solutions.”</w:t>
       </w:r>
     </w:p>
     <w:p>
@@ -445,13 +421,41 @@
         <w:rPr>
           <w:rFonts w:asciiTheme="minorBidi" w:hAnsiTheme="minorBidi"/>
         </w:rPr>
-        <w:t xml:space="preserve"> One line stating I'm open to part time contract work, roughly how many hours a week, and that I'm fine working remote. No CTA button here, this section just sets up the ask that comes </w:t>
+        <w:t xml:space="preserve"> </w:t>
+      </w:r>
+    </w:p>
+    <w:p>
+      <w:pPr>
+        <w:pStyle w:val="ListParagraph"/>
+        <w:rPr>
+          <w:rFonts w:asciiTheme="minorBidi" w:hAnsiTheme="minorBidi"/>
+        </w:rPr>
+      </w:pPr>
+      <w:r>
+        <w:rPr>
+          <w:rFonts w:asciiTheme="minorBidi" w:hAnsiTheme="minorBidi"/>
+        </w:rPr>
+        <w:t xml:space="preserve">One line stating I'm open to part time contract work, roughly how many hours a week, and that I'm fine working </w:t>
       </w:r>
       <w:proofErr w:type="gramStart"/>
       <w:r>
         <w:rPr>
           <w:rFonts w:asciiTheme="minorBidi" w:hAnsiTheme="minorBidi"/>
         </w:rPr>
+        <w:t>remote</w:t>
+      </w:r>
+      <w:proofErr w:type="gramEnd"/>
+      <w:r>
+        <w:rPr>
+          <w:rFonts w:asciiTheme="minorBidi" w:hAnsiTheme="minorBidi"/>
+        </w:rPr>
+        <w:t xml:space="preserve">. No CTA button here, this section just sets up the ask that comes </w:t>
+      </w:r>
+      <w:proofErr w:type="gramStart"/>
+      <w:r>
+        <w:rPr>
+          <w:rFonts w:asciiTheme="minorBidi" w:hAnsiTheme="minorBidi"/>
+        </w:rPr>
         <w:t>next</w:t>
       </w:r>
       <w:proofErr w:type="gramEnd"/>
@@ -461,6 +465,14 @@
         </w:rPr>
         <w:t xml:space="preserve"> so it doesn't feel sudden.</w:t>
       </w:r>
+    </w:p>
+    <w:p>
+      <w:pPr>
+        <w:pStyle w:val="ListParagraph"/>
+        <w:rPr>
+          <w:rFonts w:asciiTheme="minorBidi" w:hAnsiTheme="minorBidi"/>
+        </w:rPr>
+      </w:pPr>
     </w:p>
     <w:p>
       <w:pPr>
@@ -485,11 +497,56 @@
         <w:rPr>
           <w:rFonts w:asciiTheme="minorBidi" w:hAnsiTheme="minorBidi"/>
         </w:rPr>
-        <w:t xml:space="preserve"> The final ask. "Reply here to set up a short call about a part time contract role." This is the one action from week one, everything on the page leads here.</w:t>
-      </w:r>
-    </w:p>
-    <w:p>
-      <w:pPr>
+        <w:t xml:space="preserve"> </w:t>
+      </w:r>
+    </w:p>
+    <w:p>
+      <w:pPr>
+        <w:pStyle w:val="ListParagraph"/>
+        <w:rPr>
+          <w:rFonts w:asciiTheme="minorBidi" w:hAnsiTheme="minorBidi"/>
+        </w:rPr>
+      </w:pPr>
+      <w:r>
+        <w:rPr>
+          <w:rFonts w:asciiTheme="minorBidi" w:hAnsiTheme="minorBidi"/>
+        </w:rPr>
+        <w:lastRenderedPageBreak/>
+        <w:t xml:space="preserve">The final ask. "Reply here to set up a short call about a part time contract role," pointing to a </w:t>
+      </w:r>
+      <w:proofErr w:type="spellStart"/>
+      <w:r>
+        <w:rPr>
+          <w:rFonts w:asciiTheme="minorBidi" w:hAnsiTheme="minorBidi"/>
+        </w:rPr>
+        <w:t>mailto</w:t>
+      </w:r>
+      <w:proofErr w:type="spellEnd"/>
+      <w:r>
+        <w:rPr>
+          <w:rFonts w:asciiTheme="minorBidi" w:hAnsiTheme="minorBidi"/>
+        </w:rPr>
+        <w:t xml:space="preserve"> link, </w:t>
+      </w:r>
+      <w:hyperlink r:id="rId5" w:history="1">
+        <w:r>
+          <w:rPr>
+            <w:rStyle w:val="Hyperlink"/>
+            <w:rFonts w:asciiTheme="minorBidi" w:hAnsiTheme="minorBidi"/>
+          </w:rPr>
+          <w:t>mairaarshad019@gmail.com</w:t>
+        </w:r>
+      </w:hyperlink>
+      <w:r>
+        <w:rPr>
+          <w:rFonts w:asciiTheme="minorBidi" w:hAnsiTheme="minorBidi"/>
+        </w:rPr>
+        <w:t>. This is the one action from week one, everything on the page leads here.</w:t>
+      </w:r>
+    </w:p>
+    <w:p>
+      <w:pPr>
+        <w:pStyle w:val="ListParagraph"/>
         <w:rPr>
           <w:rFonts w:asciiTheme="minorBidi" w:hAnsiTheme="minorBidi"/>
         </w:rPr>
@@ -562,6 +619,7 @@
     </w:p>
     <w:p>
       <w:pPr>
+        <w:pStyle w:val="ListParagraph"/>
         <w:numPr>
           <w:ilvl w:val="0"/>
           <w:numId w:val="2"/>
@@ -574,15 +632,17 @@
         <w:rPr>
           <w:rFonts w:asciiTheme="minorBidi" w:hAnsiTheme="minorBidi"/>
         </w:rPr>
-        <w:t>Need to finalize the exact email or contact method I want the Contact CTA to point to</w:t>
-      </w:r>
-    </w:p>
-    <w:p>
-      <w:pPr>
-        <w:rPr>
-          <w:rFonts w:asciiTheme="minorBidi" w:hAnsiTheme="minorBidi"/>
-        </w:rPr>
-      </w:pPr>
+        <w:t xml:space="preserve">Contact method is decided, email, </w:t>
+      </w:r>
+      <w:hyperlink r:id="rId6" w:history="1">
+        <w:r>
+          <w:rPr>
+            <w:rStyle w:val="Hyperlink"/>
+            <w:rFonts w:asciiTheme="minorBidi" w:hAnsiTheme="minorBidi"/>
+          </w:rPr>
+          <w:t>mairaarshad019@gmail.com</w:t>
+        </w:r>
+      </w:hyperlink>
     </w:p>
     <w:sectPr>
       <w:pgSz w:w="12240" w:h="15840"/>
@@ -685,7 +745,7 @@
   <w:abstractNum w:abstractNumId="1" w15:restartNumberingAfterBreak="0">
     <w:nsid w:val="3EC41A77"/>
     <w:multiLevelType w:val="hybridMultilevel"/>
-    <w:tmpl w:val="06A8BD0A"/>
+    <w:tmpl w:val="AE6E5150"/>
     <w:lvl w:ilvl="0" w:tplc="04090001">
       <w:start w:val="1"/>
       <w:numFmt w:val="bullet"/>
@@ -2077,6 +2137,29 @@
       <w:spacing w:val="5"/>
     </w:rPr>
   </w:style>
+  <w:style w:type="character" w:styleId="Hyperlink">
+    <w:name w:val="Hyperlink"/>
+    <w:basedOn w:val="DefaultParagraphFont"/>
+    <w:uiPriority w:val="99"/>
+    <w:unhideWhenUsed/>
+    <w:rsid w:val="00D65AC4"/>
+    <w:rPr>
+      <w:color w:val="0563C1" w:themeColor="hyperlink"/>
+      <w:u w:val="single"/>
+    </w:rPr>
+  </w:style>
+  <w:style w:type="character" w:styleId="UnresolvedMention">
+    <w:name w:val="Unresolved Mention"/>
+    <w:basedOn w:val="DefaultParagraphFont"/>
+    <w:uiPriority w:val="99"/>
+    <w:semiHidden/>
+    <w:unhideWhenUsed/>
+    <w:rsid w:val="00D65AC4"/>
+    <w:rPr>
+      <w:color w:val="605E5C"/>
+      <w:shd w:val="clear" w:color="auto" w:fill="E1DFDD"/>
+    </w:rPr>
+  </w:style>
 </w:styles>
 </file>
 

</xml_diff>